<commit_message>
Docs: two sources plus one lookup file, not three sources
</commit_message>
<xml_diff>
--- a/docs/01_ISD_Source_Analysis.docx
+++ b/docs/01_ISD_Source_Analysis.docx
@@ -702,6 +702,14 @@
       </w:r>
       <w:r>
         <w:t xml:space="preserve">The sources</w:t>
+      </w:r>
+    </w:p>
+    <w:p>
+      <w:pPr>
+        <w:pStyle w:val="FirstParagraph"/>
+      </w:pPr>
+      <w:r>
+        <w:t xml:space="preserve">The brief gives two sources:</w:t>
       </w:r>
     </w:p>
     <w:tbl>
@@ -862,53 +870,31 @@
           </w:p>
         </w:tc>
       </w:tr>
-      <w:tr>
-        <w:tc>
-          <w:tcPr/>
-          <w:p>
-            <w:pPr>
-              <w:pStyle w:val="Compact"/>
-            </w:pPr>
-            <w:r>
-              <w:t xml:space="preserve">IP to country file</w:t>
-            </w:r>
-          </w:p>
-        </w:tc>
-        <w:tc>
-          <w:tcPr/>
-          <w:p>
-            <w:pPr>
-              <w:pStyle w:val="Compact"/>
-            </w:pPr>
-            <w:r>
-              <w:t xml:space="preserve">A small file that turns an IP address into a country</w:t>
-            </w:r>
-          </w:p>
-        </w:tc>
-        <w:tc>
-          <w:tcPr/>
-          <w:p>
-            <w:pPr>
-              <w:pStyle w:val="Compact"/>
-            </w:pPr>
-            <w:r>
-              <w:t xml:space="preserve">sources/csv/ip_country.csv</w:t>
-            </w:r>
-          </w:p>
-        </w:tc>
-        <w:tc>
-          <w:tcPr/>
-          <w:p>
-            <w:pPr>
-              <w:pStyle w:val="Compact"/>
-            </w:pPr>
-            <w:r>
-              <w:t xml:space="preserve">20 rows</w:t>
-            </w:r>
-          </w:p>
-        </w:tc>
-      </w:tr>
     </w:tbl>
+    <w:p>
+      <w:pPr>
+        <w:pStyle w:val="BodyText"/>
+      </w:pPr>
+      <w:r>
+        <w:t xml:space="preserve">We add one small</w:t>
+      </w:r>
+      <w:r>
+        <w:t xml:space="preserve"> </w:t>
+      </w:r>
+      <w:r>
+        <w:rPr>
+          <w:b/>
+          <w:bCs/>
+        </w:rPr>
+        <w:t xml:space="preserve">lookup file</w:t>
+      </w:r>
+      <w:r>
+        <w:t xml:space="preserve"> </w:t>
+      </w:r>
+      <w:r>
+        <w:t xml:space="preserve">of our own: sources/csv/ip_country.csv (20 rows). The log has an IP address but no country, and report R2 needs the country. The file turns an IP address into a country (see section 7). It is reference data we keep ourselves, not a source the business sends.</w:t>
+      </w:r>
+    </w:p>
     <w:p>
       <w:pPr>
         <w:pStyle w:val="BodyText"/>

</xml_diff>

<commit_message>
Source diagram: draw every foreign key and both change triggers
</commit_message>
<xml_diff>
--- a/docs/01_ISD_Source_Analysis.docx
+++ b/docs/01_ISD_Source_Analysis.docx
@@ -929,7 +929,7 @@
       <w:r>
         <w:drawing>
           <wp:inline>
-            <wp:extent cx="5334000" cy="3406115"/>
+            <wp:extent cx="5334000" cy="3577682"/>
             <wp:effectExtent b="0" l="0" r="0" t="0"/>
             <wp:docPr descr="Figure 1 - The source tables and how they connect" title="" id="13" name="Picture"/>
             <a:graphic>
@@ -950,7 +950,7 @@
                   <pic:spPr bwMode="auto">
                     <a:xfrm>
                       <a:off x="0" y="0"/>
-                      <a:ext cx="5334000" cy="3406115"/>
+                      <a:ext cx="5334000" cy="3577682"/>
                     </a:xfrm>
                     <a:prstGeom prst="rect">
                       <a:avLst/>

</xml_diff>